<commit_message>
Add support for macro-enabled documents (docm, pptm, xlsm) and update test files
</commit_message>
<xml_diff>
--- a/examples/output/phase3_2-docx-example.docx
+++ b/examples/output/phase3_2-docx-example.docx
@@ -5,7 +5,7 @@
     <w:p>
       <w:r>
         <w:rPr>
-          <w:b/>
+          <w:b w:val="on"/>
         </w:rPr>
         <w:t xml:space="preserve">dotnet-poi XWPF Example</w:t>
       </w:r>
@@ -13,7 +13,7 @@
     <w:p>
       <w:r>
         <w:rPr>
-          <w:i/>
+          <w:i w:val="on"/>
         </w:rPr>
         <w:t xml:space="preserve">Phase 3.2 — docx support</w:t>
       </w:r>

</xml_diff>